<commit_message>
Update homework 02 assessment and add PDF
Co-Authored-By: Claude Sonnet 5.5 <noreply@anthropic.com>
</commit_message>
<xml_diff>
--- a/02_homework/02_homework_assessment.docx
+++ b/02_homework/02_homework_assessment.docx
@@ -69,7 +69,13 @@
         <w:spacing w:after="192"/>
       </w:pPr>
       <w:r>
-        <w:t>Even though I do have some coding experience due to the course “Informatics 1”, I watched the 2hr video on Python fundamentals. I did skip some parts as they were rather repetition than new to me. While watching, I tried to take some notes and completed the short quizzes in the video.</w:t>
+        <w:t>Even though I do have some coding experience due to the course “Informatics 1”, I watched the 2</w:t>
+      </w:r>
+      <w:r>
+        <w:t>hr</w:t>
+      </w:r>
+      <w:r>
+        <w:t xml:space="preserve"> video on Python fundamentals. I did skip some parts as they were rather repetition than new to me. While watching, I tried to take some notes and completed the short quizzes in the video.</w:t>
       </w:r>
     </w:p>
     <w:p>
@@ -136,7 +142,7 @@
         <w:t>was</w:t>
       </w:r>
       <w:r>
-        <w:t xml:space="preserve"> a built in </w:t>
+        <w:t xml:space="preserve"> built in </w:t>
       </w:r>
       <w:r>
         <w:t xml:space="preserve">a complicated way in </w:t>
@@ -188,7 +194,13 @@
         <w:spacing w:after="192"/>
       </w:pPr>
       <w:r>
-        <w:t>In the following weeks, I would like to be able to code complicated-looking tasks in a simple way (like the word guesser). When I tried coding it without template, my code got super long and confusing.</w:t>
+        <w:t xml:space="preserve">In the following weeks, I would like to be able to code complicated-looking tasks in a simple way (like the word guesser). When I tried coding it without </w:t>
+      </w:r>
+      <w:r>
+        <w:t xml:space="preserve">the </w:t>
+      </w:r>
+      <w:r>
+        <w:t>template, my code got super long and confusing.</w:t>
       </w:r>
     </w:p>
     <w:p>
@@ -219,7 +231,7 @@
         <w:t>P</w:t>
       </w:r>
       <w:r>
-        <w:t>ython etc. I will need to get a bit more into that.</w:t>
+        <w:t>ython. I will need to get a bit more into that.</w:t>
       </w:r>
     </w:p>
     <w:p>

</xml_diff>